<commit_message>
Add missing self-introduction to backlog #3's script
Aji caught that the finalized GDPR script had no self-introduction
anywhere. Root cause: template 6 (myth vs. mechanism) never had an
explicit credibility beat in its CLAUDE.md definition, unlike
templates 1 and 3.

- CLAUDE.md: template 6's "The reveal" step now opens with a brief
  "if you're new here" self-intro (name + topic-relevant credentials),
  folded into the reveal so the hook stays purely sensory/evidence-driven.
- Script: added the matching self-intro paragraph to the top of
  THE REVEAL section; recomputed all downstream timestamps
  (2,058 -> 2,102 words, ~14.7 -> ~15.0 min, landing almost exactly
  on the 15-minute target).
- Regenerated the exported Word doc to match.
- Logged the gap and fix in producer-memory.md and production-log.md.

Co-Authored-By: Claude Sonnet 5 <noreply@anthropic.com>
Claude-Session: https://claude.ai/code/session_01QV1SYMTsGQAzKR37rUBYXr
</commit_message>
<xml_diff>
--- a/scripts/exports/03-the-data-mistake-that-gets-companies-fined-millions.docx
+++ b/scripts/exports/03-the-data-mistake-that-gets-companies-fined-millions.docx
@@ -171,7 +171,7 @@
                 <w:sz w:val="18"/>
                 <w:szCs w:val="18"/>
               </w:rPr>
-              <w:t xml:space="preserve">~14.7 minutes (~2,058 words)</w:t>
+              <w:t xml:space="preserve">~15.0 minutes (~2,102 words)</w:t>
             </w:r>
           </w:p>
         </w:tc>
@@ -566,7 +566,20 @@
           <w:sz w:val="20"/>
           <w:szCs w:val="20"/>
         </w:rPr>
-        <w:t xml:space="preserve">   1:52–4:11</w:t>
+        <w:t xml:space="preserve">   1:52–4:30</w:t>
+      </w:r>
+    </w:p>
+    <w:p>
+      <w:pPr>
+        <w:spacing w:after="160" w:line="300"/>
+      </w:pPr>
+      <w:r>
+        <w:rPr>
+          <w:rFonts w:ascii="Calibri" w:cs="Calibri" w:eastAsia="Calibri" w:hAnsi="Calibri"/>
+          <w:sz w:val="24"/>
+          <w:szCs w:val="24"/>
+        </w:rPr>
+        <w:t xml:space="preserve">If you're new here — I'm Aji Saine. Twelve-plus years in data management, and I've worked this exact problem from both sides: building the systems that hold people's data, and now managing statutory reporting for a UK university, where getting it wrong isn't hypothetical.</w:t>
       </w:r>
     </w:p>
     <w:p>
@@ -660,7 +673,7 @@
           <w:sz w:val="20"/>
           <w:szCs w:val="20"/>
         </w:rPr>
-        <w:t xml:space="preserve">   4:11–8:11</w:t>
+        <w:t xml:space="preserve">   4:30–8:30</w:t>
       </w:r>
     </w:p>
     <w:p>
@@ -819,7 +832,7 @@
           <w:sz w:val="20"/>
           <w:szCs w:val="20"/>
         </w:rPr>
-        <w:t xml:space="preserve">   8:11–11:17</w:t>
+        <w:t xml:space="preserve">   8:30–11:36</w:t>
       </w:r>
     </w:p>
     <w:p>
@@ -952,7 +965,7 @@
           <w:sz w:val="20"/>
           <w:szCs w:val="20"/>
         </w:rPr>
-        <w:t xml:space="preserve">   11:17–14:12</w:t>
+        <w:t xml:space="preserve">   11:36–14:31</w:t>
       </w:r>
     </w:p>
     <w:p>
@@ -1098,7 +1111,7 @@
           <w:sz w:val="20"/>
           <w:szCs w:val="20"/>
         </w:rPr>
-        <w:t xml:space="preserve">   14:12–14:38</w:t>
+        <w:t xml:space="preserve">   14:31–14:57</w:t>
       </w:r>
     </w:p>
     <w:p>
@@ -1166,7 +1179,7 @@
           <w:sz w:val="20"/>
           <w:szCs w:val="20"/>
         </w:rPr>
-        <w:t xml:space="preserve">   14:38–14:41</w:t>
+        <w:t xml:space="preserve">   14:57–15:00</w:t>
       </w:r>
     </w:p>
     <w:p>

</xml_diff>

<commit_message>
Fix self-intro: 12+ years is combined dev+data management, not 12 in data management alone
Aji's self-intro added earlier today misstated the years-of-experience
claim as "twelve-plus years in data management." Corrected breakdown:
6+ years in software development first, then 6 years in data
management (current).

- Script: self-intro line in THE REVEAL now states the split.
- CLAUDE.md: presenter bio tightened to state the 6+/6 split explicitly.
- Regenerated the exported Word doc to match.
- Checked Video 1's draft for the same error — it already attributes
  the 12+ years across both careers correctly, no change needed.
- Logged the correction in producer-memory.md and production-log.md.

Co-Authored-By: Claude Sonnet 5 <noreply@anthropic.com>
Claude-Session: https://claude.ai/code/session_01QV1SYMTsGQAzKR37rUBYXr
</commit_message>
<xml_diff>
--- a/scripts/exports/03-the-data-mistake-that-gets-companies-fined-millions.docx
+++ b/scripts/exports/03-the-data-mistake-that-gets-companies-fined-millions.docx
@@ -171,7 +171,7 @@
                 <w:sz w:val="18"/>
                 <w:szCs w:val="18"/>
               </w:rPr>
-              <w:t xml:space="preserve">~15.0 minutes (~2,102 words)</w:t>
+              <w:t xml:space="preserve">~15.0 minutes (~2,104 words)</w:t>
             </w:r>
           </w:p>
         </w:tc>
@@ -579,7 +579,7 @@
           <w:sz w:val="24"/>
           <w:szCs w:val="24"/>
         </w:rPr>
-        <w:t xml:space="preserve">If you're new here — I'm Aji Saine. Twelve-plus years in data management, and I've worked this exact problem from both sides: building the systems that hold people's data, and now managing statutory reporting for a UK university, where getting it wrong isn't hypothetical.</w:t>
+        <w:t xml:space="preserve">If you're new here — I'm Aji Saine. Twelve-plus years split between software development and data management — six-plus years writing the software that holds people's data, six years now managing it, most recently statutory reporting for a UK university, where getting it wrong isn't hypothetical.</w:t>
       </w:r>
     </w:p>
     <w:p>

</xml_diff>